<commit_message>
Ajustar comunicación a Evertec para basarla solo en lo reportado en la encuesta
Co-Authored-By: Claude Opus 5.5 <noreply@anthropic.com>
Claude-Session: https://claude.ai/code/session_01DdHtXnKkH2zWgkQRN2ahpo
</commit_message>
<xml_diff>
--- a/informes/Comunicacion_Evertec_Plan_de_Accion.docx
+++ b/informes/Comunicacion_Evertec_Plan_de_Accion.docx
@@ -173,7 +173,7 @@
                 <w:sz w:val="19"/>
                 <w:szCs w:val="19"/>
               </w:rPr>
-              <w:t xml:space="preserve">[Nombre], [Cargo] – Evertec · [Nombre], Ejecutivo(a) de Cuenta – Evertec</w:t>
+              <w:t xml:space="preserve">[Nombre], [Cargo] – Evertec</w:t>
             </w:r>
           </w:p>
         </w:tc>
@@ -236,7 +236,7 @@
                 <w:sz w:val="19"/>
                 <w:szCs w:val="19"/>
               </w:rPr>
-              <w:t xml:space="preserve">Gerencia General · Gerencia de Operaciones · Gerencia de Negocios / Tarjetas · Gerencia de Riesgos · Gerencia de Tecnología – Comedica</w:t>
+              <w:t xml:space="preserve">Equipo directivo – Comedica</w:t>
             </w:r>
           </w:p>
         </w:tc>
@@ -299,7 +299,7 @@
                 <w:sz w:val="19"/>
                 <w:szCs w:val="19"/>
               </w:rPr>
-              <w:t xml:space="preserve">[Nombre], Gerente de Operaciones – Comedica</w:t>
+              <w:t xml:space="preserve">[Nombre], [Cargo] – Comedica</w:t>
             </w:r>
           </w:p>
         </w:tc>
@@ -425,7 +425,7 @@
                 <w:sz w:val="19"/>
                 <w:szCs w:val="19"/>
               </w:rPr>
-              <w:t xml:space="preserve">Resultados de la evaluación del servicio de septiembre de 2026 y solicitud de plan de acción con fechas compromiso</w:t>
+              <w:t xml:space="preserve">Resultados de la Encuesta de Evaluación del Servicio de Procesamiento de Tarjetas de Crédito (Evertec) y solicitud de plan de acción</w:t>
             </w:r>
           </w:p>
         </w:tc>
@@ -466,58 +466,189 @@
           <w:b/>
           <w:bCs/>
         </w:rPr>
-        <w:t xml:space="preserve">Encuesta de Evaluación del Servicio de Procesamiento de Tarjetas de Crédito</w:t>
-      </w:r>
-      <w:r>
-        <w:t xml:space="preserve">, aplicada el 16 y 17 de septiembre de 2026 a 17 colaboradores de 9 agencias y de la Agencia Móvil de Comedica. Estos colaboradores atienden directamente a nuestros asociados.</w:t>
-      </w:r>
-    </w:p>
-    <w:p>
-      <w:pPr>
-        <w:spacing w:after="160"/>
-        <w:jc w:val="both"/>
-      </w:pPr>
-      <w:r>
-        <w:t xml:space="preserve">Reconocemos que el personal valora la rapidez con que Evertec atiende los reportes: 15 de 17 colaboradores indicaron que la atención es oportuna. Sin embargo, la evaluación también muestra que </w:t>
+        <w:t xml:space="preserve">Encuesta de Evaluación del Servicio de Procesamiento de Tarjetas de Crédito (Evertec)</w:t>
+      </w:r>
+      <w:r>
+        <w:t xml:space="preserve">, contestada el 16 y 17 de septiembre de 2026 por 17 colaboradores de Comedica de las agencias San Miguel, Colonia Médica, Sonsonate, Santa Ana, Plaza Mundo, Plaza Merliot, Colegio Médico, Usulután, Central y Jefe Móvil.</w:t>
+      </w:r>
+    </w:p>
+    <w:p>
+      <w:pPr>
+        <w:spacing w:after="160"/>
+        <w:jc w:val="both"/>
+      </w:pPr>
+      <w:r>
+        <w:t xml:space="preserve">En la calificación general del servicio, 14 colaboradores asignaron nota de 4 y 3 colaboradores nota de 3. En cuanto a qué tan fácil resulta resolver los casos, 8 colaboradores respondieron "Fácil" o "Muy fácil", 8 respondieron "Regular" y 1 respondió "Difícil". Además, 14 de los 17 colaboradores reportaron problemas e inconvenientes que requieren corrección.</w:t>
+      </w:r>
+    </w:p>
+    <w:p>
+      <w:pPr>
+        <w:spacing w:after="160"/>
+        <w:jc w:val="both"/>
+      </w:pPr>
+      <w:r>
+        <w:t xml:space="preserve">A continuación se detallan los puntos críticos, </w:t>
       </w:r>
       <w:r>
         <w:rPr>
           <w:b/>
           <w:bCs/>
         </w:rPr>
-        <w:t xml:space="preserve">9 de 17 colaboradores consideran que resolver los problemas es regular o difícil</w:t>
-      </w:r>
-      <w:r>
-        <w:t xml:space="preserve"> y que </w:t>
-      </w:r>
+        <w:t xml:space="preserve">citando lo reportado por los colaboradores en la encuesta</w:t>
+      </w:r>
+      <w:r>
+        <w:t xml:space="preserve">, y lo que solicitamos para cada uno:</w:t>
+      </w:r>
+    </w:p>
+    <w:p>
+      <w:pPr>
+        <w:pStyle w:val="Heading2"/>
+      </w:pPr>
+      <w:r>
+        <w:t xml:space="preserve">1. Estabilidad y rendimiento de la plataforma</w:t>
+      </w:r>
+    </w:p>
+    <w:p>
+      <w:pPr>
+        <w:spacing w:after="160"/>
+        <w:jc w:val="both"/>
+      </w:pPr>
       <w:r>
         <w:rPr>
           <w:b/>
           <w:bCs/>
         </w:rPr>
-        <w:t xml:space="preserve">7 de 17 los enfrentan con frecuencia</w:t>
-      </w:r>
-      <w:r>
-        <w:t xml:space="preserve">. Estas situaciones afectan directamente la experiencia de nuestros asociados, generan reprocesos en las agencias y exponen a la institución a riesgos operativos, de fraude y de reputación.</w:t>
-      </w:r>
-    </w:p>
-    <w:p>
-      <w:pPr>
-        <w:spacing w:after="160"/>
-        <w:jc w:val="both"/>
-      </w:pPr>
-      <w:r>
-        <w:t xml:space="preserve">Por lo anterior, </w:t>
-      </w:r>
+        <w:t xml:space="preserve">Lo reportado en la encuesta:</w:t>
+      </w:r>
+    </w:p>
+    <w:p>
+      <w:pPr>
+        <w:pStyle w:val="ListParagraph"/>
+        <w:numPr>
+          <w:ilvl w:val="0"/>
+          <w:numId w:val="2"/>
+        </w:numPr>
+        <w:spacing w:after="80"/>
+      </w:pPr>
+      <w:r>
+        <w:t xml:space="preserve">"La conexión con EVERTEC algunas veces falla".</w:t>
+      </w:r>
+    </w:p>
+    <w:p>
+      <w:pPr>
+        <w:pStyle w:val="ListParagraph"/>
+        <w:numPr>
+          <w:ilvl w:val="0"/>
+          <w:numId w:val="2"/>
+        </w:numPr>
+        <w:spacing w:after="80"/>
+      </w:pPr>
+      <w:r>
+        <w:t xml:space="preserve">"Tiempos de respuesta en fechas de pago. Caídas de sistema a veces no se resuelven pronto".</w:t>
+      </w:r>
+    </w:p>
+    <w:p>
+      <w:pPr>
+        <w:pStyle w:val="ListParagraph"/>
+        <w:numPr>
+          <w:ilvl w:val="0"/>
+          <w:numId w:val="2"/>
+        </w:numPr>
+        <w:spacing w:after="80"/>
+      </w:pPr>
+      <w:r>
+        <w:t xml:space="preserve">"Considero que debe mejorarse la rapidez de respuesta del sistema al cambiar de pantalla o seleccionar las diferentes opciones".</w:t>
+      </w:r>
+    </w:p>
+    <w:p>
+      <w:pPr>
+        <w:pStyle w:val="ListParagraph"/>
+        <w:numPr>
+          <w:ilvl w:val="0"/>
+          <w:numId w:val="2"/>
+        </w:numPr>
+        <w:spacing w:after="80"/>
+      </w:pPr>
+      <w:r>
+        <w:t xml:space="preserve">"El tiempo de respuesta para aplicación de compras en flotantes, tanto de TC y TD".</w:t>
+      </w:r>
+    </w:p>
+    <w:p>
+      <w:pPr>
+        <w:pStyle w:val="ListParagraph"/>
+        <w:numPr>
+          <w:ilvl w:val="0"/>
+          <w:numId w:val="2"/>
+        </w:numPr>
+        <w:spacing w:after="80"/>
+      </w:pPr>
+      <w:r>
+        <w:t xml:space="preserve">"Comunicación con Evertec".</w:t>
+      </w:r>
+    </w:p>
+    <w:p>
+      <w:pPr>
+        <w:spacing w:after="160"/>
+        <w:jc w:val="both"/>
+      </w:pPr>
       <w:r>
         <w:rPr>
           <w:b/>
           <w:bCs/>
         </w:rPr>
-        <w:t xml:space="preserve">solicitamos formalmente la corrección de los siguientes puntos críticos</w:t>
-      </w:r>
-      <w:r>
-        <w:t xml:space="preserve">:</w:t>
+        <w:t xml:space="preserve">Solicitamos:</w:t>
+      </w:r>
+    </w:p>
+    <w:p>
+      <w:pPr>
+        <w:pStyle w:val="ListParagraph"/>
+        <w:numPr>
+          <w:ilvl w:val="0"/>
+          <w:numId w:val="2"/>
+        </w:numPr>
+        <w:spacing w:after="80"/>
+      </w:pPr>
+      <w:r>
+        <w:t xml:space="preserve">Identificar la causa de las fallas de conexión, las caídas y la lentitud del sistema.</w:t>
+      </w:r>
+    </w:p>
+    <w:p>
+      <w:pPr>
+        <w:pStyle w:val="ListParagraph"/>
+        <w:numPr>
+          <w:ilvl w:val="0"/>
+          <w:numId w:val="2"/>
+        </w:numPr>
+        <w:spacing w:after="80"/>
+      </w:pPr>
+      <w:r>
+        <w:t xml:space="preserve">Presentar un plan para resolverlas, con responsables y fechas.</w:t>
+      </w:r>
+    </w:p>
+    <w:p>
+      <w:pPr>
+        <w:pStyle w:val="ListParagraph"/>
+        <w:numPr>
+          <w:ilvl w:val="0"/>
+          <w:numId w:val="2"/>
+        </w:numPr>
+        <w:spacing w:after="80"/>
+      </w:pPr>
+      <w:r>
+        <w:t xml:space="preserve">Reportar el cumplimiento de los niveles de servicio (SLA) acordados, incluyendo el tiempo de solución de las caídas.</w:t>
+      </w:r>
+    </w:p>
+    <w:p>
+      <w:pPr>
+        <w:pStyle w:val="ListParagraph"/>
+        <w:numPr>
+          <w:ilvl w:val="0"/>
+          <w:numId w:val="2"/>
+        </w:numPr>
+        <w:spacing w:after="80"/>
+      </w:pPr>
+      <w:r>
+        <w:t xml:space="preserve">Mejorar los tiempos de respuesta en fechas de pago y en la aplicación de compras en flotantes de tarjeta de crédito y débito.</w:t>
       </w:r>
     </w:p>
     <w:p>
@@ -525,7 +656,7 @@
         <w:pStyle w:val="Heading2"/>
       </w:pPr>
       <w:r>
-        <w:t xml:space="preserve">1. Estabilidad y rendimiento de la plataforma</w:t>
+        <w:t xml:space="preserve">2. Procesamiento de reversas</w:t>
       </w:r>
     </w:p>
     <w:p>
@@ -538,10 +669,46 @@
           <w:b/>
           <w:bCs/>
         </w:rPr>
-        <w:t xml:space="preserve">Situación reportada:</w:t>
-      </w:r>
-      <w:r>
-        <w:t xml:space="preserve"> caídas intermitentes de la conexión, caídas del sistema que no se resuelven con prontitud, lentitud al cambiar de pantalla o seleccionar opciones, y demoras en fechas de pago y en la aplicación de compras en flotantes de tarjeta de crédito y de débito.</w:t>
+        <w:t xml:space="preserve">Lo reportado en la encuesta:</w:t>
+      </w:r>
+    </w:p>
+    <w:p>
+      <w:pPr>
+        <w:pStyle w:val="ListParagraph"/>
+        <w:numPr>
+          <w:ilvl w:val="0"/>
+          <w:numId w:val="2"/>
+        </w:numPr>
+        <w:spacing w:after="80"/>
+      </w:pPr>
+      <w:r>
+        <w:t xml:space="preserve">"La comunicación con la plataforma de Evertec principalmente al monto de reversas porque en ocasiones no las acepta Evertec…".</w:t>
+      </w:r>
+    </w:p>
+    <w:p>
+      <w:pPr>
+        <w:pStyle w:val="ListParagraph"/>
+        <w:numPr>
+          <w:ilvl w:val="0"/>
+          <w:numId w:val="2"/>
+        </w:numPr>
+        <w:spacing w:after="80"/>
+      </w:pPr>
+      <w:r>
+        <w:t xml:space="preserve">"Las reversas de transacción".</w:t>
+      </w:r>
+    </w:p>
+    <w:p>
+      <w:pPr>
+        <w:pStyle w:val="ListParagraph"/>
+        <w:numPr>
+          <w:ilvl w:val="0"/>
+          <w:numId w:val="2"/>
+        </w:numPr>
+        <w:spacing w:after="80"/>
+      </w:pPr>
+      <w:r>
+        <w:t xml:space="preserve">"Las duplicidades en los pagos cuando hay caídas de sistemas: en Siscard lo toma y en sistema de Comedica no aparece procesado".</w:t>
       </w:r>
     </w:p>
     <w:p>
@@ -554,72 +721,46 @@
           <w:b/>
           <w:bCs/>
         </w:rPr>
-        <w:t xml:space="preserve">Requerimos:</w:t>
-      </w:r>
-    </w:p>
-    <w:p>
-      <w:pPr>
-        <w:pStyle w:val="ListParagraph"/>
-        <w:numPr>
-          <w:ilvl w:val="0"/>
-          <w:numId w:val="2"/>
-        </w:numPr>
-        <w:spacing w:after="80"/>
-      </w:pPr>
-      <w:r>
-        <w:t xml:space="preserve">Un diagnóstico de la causa de las caídas y de la lentitud registradas en los últimos 90 días.</w:t>
-      </w:r>
-    </w:p>
-    <w:p>
-      <w:pPr>
-        <w:pStyle w:val="ListParagraph"/>
-        <w:numPr>
-          <w:ilvl w:val="0"/>
-          <w:numId w:val="2"/>
-        </w:numPr>
-        <w:spacing w:after="80"/>
-      </w:pPr>
-      <w:r>
-        <w:t xml:space="preserve">Un plan de estabilización con acciones concretas, responsables y fechas.</w:t>
-      </w:r>
-    </w:p>
-    <w:p>
-      <w:pPr>
-        <w:pStyle w:val="ListParagraph"/>
-        <w:numPr>
-          <w:ilvl w:val="0"/>
-          <w:numId w:val="2"/>
-        </w:numPr>
-        <w:spacing w:after="80"/>
-      </w:pPr>
-      <w:r>
-        <w:t xml:space="preserve">Un reporte mensual del cumplimiento de los niveles de servicio (SLA) pactados en el contrato: disponibilidad, tiempos de respuesta y tiempos de restablecimiento.</w:t>
-      </w:r>
-    </w:p>
-    <w:p>
-      <w:pPr>
-        <w:pStyle w:val="ListParagraph"/>
-        <w:numPr>
-          <w:ilvl w:val="0"/>
-          <w:numId w:val="2"/>
-        </w:numPr>
-        <w:spacing w:after="80"/>
-      </w:pPr>
-      <w:r>
-        <w:t xml:space="preserve">Un protocolo de aviso inmediato a Comedica ante cualquier incidente, con tiempo estimado de solución.</w:t>
-      </w:r>
-    </w:p>
-    <w:p>
-      <w:pPr>
-        <w:pStyle w:val="ListParagraph"/>
-        <w:numPr>
-          <w:ilvl w:val="0"/>
-          <w:numId w:val="2"/>
-        </w:numPr>
-        <w:spacing w:after="80"/>
-      </w:pPr>
-      <w:r>
-        <w:t xml:space="preserve">Refuerzo de la capacidad de la plataforma en fechas de pago y días de alta demanda.</w:t>
+        <w:t xml:space="preserve">Solicitamos:</w:t>
+      </w:r>
+    </w:p>
+    <w:p>
+      <w:pPr>
+        <w:pStyle w:val="ListParagraph"/>
+        <w:numPr>
+          <w:ilvl w:val="0"/>
+          <w:numId w:val="2"/>
+        </w:numPr>
+        <w:spacing w:after="80"/>
+      </w:pPr>
+      <w:r>
+        <w:t xml:space="preserve">Corregir la causa por la que Evertec no acepta algunas reversas.</w:t>
+      </w:r>
+    </w:p>
+    <w:p>
+      <w:pPr>
+        <w:pStyle w:val="ListParagraph"/>
+        <w:numPr>
+          <w:ilvl w:val="0"/>
+          <w:numId w:val="2"/>
+        </w:numPr>
+        <w:spacing w:after="80"/>
+      </w:pPr>
+      <w:r>
+        <w:t xml:space="preserve">Asegurar que los pagos y reversas registrados en Siscard coincidan con los procesados en el sistema de Comedica, especialmente cuando hay caídas del sistema.</w:t>
+      </w:r>
+    </w:p>
+    <w:p>
+      <w:pPr>
+        <w:pStyle w:val="ListParagraph"/>
+        <w:numPr>
+          <w:ilvl w:val="0"/>
+          <w:numId w:val="2"/>
+        </w:numPr>
+        <w:spacing w:after="80"/>
+      </w:pPr>
+      <w:r>
+        <w:t xml:space="preserve">Definir cómo y en qué plazo se corregirán los pagos duplicados y las reversas no aplicadas.</w:t>
       </w:r>
     </w:p>
     <w:p>
@@ -627,7 +768,7 @@
         <w:pStyle w:val="Heading2"/>
       </w:pPr>
       <w:r>
-        <w:t xml:space="preserve">2. Procesamiento de reversas</w:t>
+        <w:t xml:space="preserve">3. Calidad de los plásticos y tiempos de reposición</w:t>
       </w:r>
     </w:p>
     <w:p>
@@ -640,10 +781,33 @@
           <w:b/>
           <w:bCs/>
         </w:rPr>
-        <w:t xml:space="preserve">Situación reportada:</w:t>
-      </w:r>
-      <w:r>
-        <w:t xml:space="preserve"> reversas que Evertec rechaza a pesar de estar registradas en el sistema interno de Comedica, diferencias en los montos de reversas y pagos duplicados cuando hay caídas del sistema. Estos pagos quedan registrados en SISCARD, pero no aparecen procesados en el sistema de Comedica.</w:t>
+        <w:t xml:space="preserve">Lo reportado en la encuesta:</w:t>
+      </w:r>
+    </w:p>
+    <w:p>
+      <w:pPr>
+        <w:pStyle w:val="ListParagraph"/>
+        <w:numPr>
+          <w:ilvl w:val="0"/>
+          <w:numId w:val="2"/>
+        </w:numPr>
+        <w:spacing w:after="80"/>
+      </w:pPr>
+      <w:r>
+        <w:t xml:space="preserve">"Asociados indican que plásticos le está dando bastante inconveniente al querer realizar compras; se realizan reposiciones muy frecuentemente porque plástico no funciona. El proceso de reposición es muy tardado".</w:t>
+      </w:r>
+    </w:p>
+    <w:p>
+      <w:pPr>
+        <w:pStyle w:val="ListParagraph"/>
+        <w:numPr>
+          <w:ilvl w:val="0"/>
+          <w:numId w:val="2"/>
+        </w:numPr>
+        <w:spacing w:after="80"/>
+      </w:pPr>
+      <w:r>
+        <w:t xml:space="preserve">"Que cuando se olvida a los chicos de caja la clave, la reinicie Evertec, porque a veces cuesta que nos solucionen en tarjeta".</w:t>
       </w:r>
     </w:p>
     <w:p>
@@ -656,59 +820,46 @@
           <w:b/>
           <w:bCs/>
         </w:rPr>
-        <w:t xml:space="preserve">Requerimos:</w:t>
-      </w:r>
-    </w:p>
-    <w:p>
-      <w:pPr>
-        <w:pStyle w:val="ListParagraph"/>
-        <w:numPr>
-          <w:ilvl w:val="0"/>
-          <w:numId w:val="2"/>
-        </w:numPr>
-        <w:spacing w:after="80"/>
-      </w:pPr>
-      <w:r>
-        <w:t xml:space="preserve">Identificar y corregir la causa de los rechazos de reversas.</w:t>
-      </w:r>
-    </w:p>
-    <w:p>
-      <w:pPr>
-        <w:pStyle w:val="ListParagraph"/>
-        <w:numPr>
-          <w:ilvl w:val="0"/>
-          <w:numId w:val="2"/>
-        </w:numPr>
-        <w:spacing w:after="80"/>
-      </w:pPr>
-      <w:r>
-        <w:t xml:space="preserve">Establecer una conciliación diaria entre la plataforma de Evertec y el sistema de Comedica, con reporte de diferencias.</w:t>
-      </w:r>
-    </w:p>
-    <w:p>
-      <w:pPr>
-        <w:pStyle w:val="ListParagraph"/>
-        <w:numPr>
-          <w:ilvl w:val="0"/>
-          <w:numId w:val="2"/>
-        </w:numPr>
-        <w:spacing w:after="80"/>
-      </w:pPr>
-      <w:r>
-        <w:t xml:space="preserve">Definir un procedimiento y un tiempo máximo para regularizar las reversas rechazadas y los pagos duplicados.</w:t>
-      </w:r>
-    </w:p>
-    <w:p>
-      <w:pPr>
-        <w:pStyle w:val="ListParagraph"/>
-        <w:numPr>
-          <w:ilvl w:val="0"/>
-          <w:numId w:val="2"/>
-        </w:numPr>
-        <w:spacing w:after="80"/>
-      </w:pPr>
-      <w:r>
-        <w:t xml:space="preserve">Presentar un informe de los casos pendientes a la fecha y la fecha de su regularización.</w:t>
+        <w:t xml:space="preserve">Solicitamos:</w:t>
+      </w:r>
+    </w:p>
+    <w:p>
+      <w:pPr>
+        <w:pStyle w:val="ListParagraph"/>
+        <w:numPr>
+          <w:ilvl w:val="0"/>
+          <w:numId w:val="2"/>
+        </w:numPr>
+        <w:spacing w:after="80"/>
+      </w:pPr>
+      <w:r>
+        <w:t xml:space="preserve">Revisar los plásticos que están fallando e identificar la causa.</w:t>
+      </w:r>
+    </w:p>
+    <w:p>
+      <w:pPr>
+        <w:pStyle w:val="ListParagraph"/>
+        <w:numPr>
+          <w:ilvl w:val="0"/>
+          <w:numId w:val="2"/>
+        </w:numPr>
+        <w:spacing w:after="80"/>
+      </w:pPr>
+      <w:r>
+        <w:t xml:space="preserve">Reducir el tiempo del proceso de reposición.</w:t>
+      </w:r>
+    </w:p>
+    <w:p>
+      <w:pPr>
+        <w:pStyle w:val="ListParagraph"/>
+        <w:numPr>
+          <w:ilvl w:val="0"/>
+          <w:numId w:val="2"/>
+        </w:numPr>
+        <w:spacing w:after="80"/>
+      </w:pPr>
+      <w:r>
+        <w:t xml:space="preserve">Agilizar el reinicio de clave del personal de caja.</w:t>
       </w:r>
     </w:p>
     <w:p>
@@ -716,7 +867,7 @@
         <w:pStyle w:val="Heading2"/>
       </w:pPr>
       <w:r>
-        <w:t xml:space="preserve">3. Calidad de los plásticos y tiempos de reemisión</w:t>
+        <w:t xml:space="preserve">4. Transparencia en abonos y notas de crédito</w:t>
       </w:r>
     </w:p>
     <w:p>
@@ -729,10 +880,20 @@
           <w:b/>
           <w:bCs/>
         </w:rPr>
-        <w:t xml:space="preserve">Situación reportada:</w:t>
-      </w:r>
-      <w:r>
-        <w:t xml:space="preserve"> los asociados reportan plásticos que fallan al momento de hacer compras, lo que obliga a reposiciones muy frecuentes. Además, el proceso de reposición es muy tardado.</w:t>
+        <w:t xml:space="preserve">Lo reportado en la encuesta:</w:t>
+      </w:r>
+    </w:p>
+    <w:p>
+      <w:pPr>
+        <w:pStyle w:val="ListParagraph"/>
+        <w:numPr>
+          <w:ilvl w:val="0"/>
+          <w:numId w:val="2"/>
+        </w:numPr>
+        <w:spacing w:after="80"/>
+      </w:pPr>
+      <w:r>
+        <w:t xml:space="preserve">"Actualmente, estos abonos se registran únicamente bajo el concepto de 'Nota de Crédito', lo que genera confusión entre los asociados al no identificar claramente el origen del descuento recibido. Una descripción más detallada contribuiría…".</w:t>
       </w:r>
     </w:p>
     <w:p>
@@ -745,59 +906,20 @@
           <w:b/>
           <w:bCs/>
         </w:rPr>
-        <w:t xml:space="preserve">Requerimos:</w:t>
-      </w:r>
-    </w:p>
-    <w:p>
-      <w:pPr>
-        <w:pStyle w:val="ListParagraph"/>
-        <w:numPr>
-          <w:ilvl w:val="0"/>
-          <w:numId w:val="2"/>
-        </w:numPr>
-        <w:spacing w:after="80"/>
-      </w:pPr>
-      <w:r>
-        <w:t xml:space="preserve">Una revisión de los lotes de plásticos emitidos, identificando los lotes defectuosos y la causa de la falla.</w:t>
-      </w:r>
-    </w:p>
-    <w:p>
-      <w:pPr>
-        <w:pStyle w:val="ListParagraph"/>
-        <w:numPr>
-          <w:ilvl w:val="0"/>
-          <w:numId w:val="2"/>
-        </w:numPr>
-        <w:spacing w:after="80"/>
-      </w:pPr>
-      <w:r>
-        <w:t xml:space="preserve">Un plan de sustitución de los plásticos afectados, sin costo para Comedica ni para sus asociados.</w:t>
-      </w:r>
-    </w:p>
-    <w:p>
-      <w:pPr>
-        <w:pStyle w:val="ListParagraph"/>
-        <w:numPr>
-          <w:ilvl w:val="0"/>
-          <w:numId w:val="2"/>
-        </w:numPr>
-        <w:spacing w:after="80"/>
-      </w:pPr>
-      <w:r>
-        <w:t xml:space="preserve">Un tiempo máximo comprometido para las reposiciones, con seguimiento de cumplimiento.</w:t>
-      </w:r>
-    </w:p>
-    <w:p>
-      <w:pPr>
-        <w:pStyle w:val="ListParagraph"/>
-        <w:numPr>
-          <w:ilvl w:val="0"/>
-          <w:numId w:val="2"/>
-        </w:numPr>
-        <w:spacing w:after="80"/>
-      </w:pPr>
-      <w:r>
-        <w:t xml:space="preserve">Agilizar el restablecimiento de la clave del personal de caja cuando la olvide, con un tiempo máximo de atención.</w:t>
+        <w:t xml:space="preserve">Solicitamos:</w:t>
+      </w:r>
+    </w:p>
+    <w:p>
+      <w:pPr>
+        <w:pStyle w:val="ListParagraph"/>
+        <w:numPr>
+          <w:ilvl w:val="0"/>
+          <w:numId w:val="2"/>
+        </w:numPr>
+        <w:spacing w:after="80"/>
+      </w:pPr>
+      <w:r>
+        <w:t xml:space="preserve">Sustituir el concepto genérico "Nota de Crédito" por una descripción específica del beneficio o campaña que origina cada abono, para que el asociado identifique claramente el origen del descuento.</w:t>
       </w:r>
     </w:p>
     <w:p>
@@ -805,7 +927,7 @@
         <w:pStyle w:val="Heading2"/>
       </w:pPr>
       <w:r>
-        <w:t xml:space="preserve">4. Transparencia en abonos y notas de crédito</w:t>
+        <w:t xml:space="preserve">5. Contracargos, fraude y acreditación de promociones</w:t>
       </w:r>
     </w:p>
     <w:p>
@@ -818,148 +940,98 @@
           <w:b/>
           <w:bCs/>
         </w:rPr>
-        <w:t xml:space="preserve">Situación reportada:</w:t>
-      </w:r>
-      <w:r>
-        <w:t xml:space="preserve"> los abonos por beneficios se registran únicamente con el concepto genérico </w:t>
-      </w:r>
+        <w:t xml:space="preserve">Lo reportado en la encuesta:</w:t>
+      </w:r>
+    </w:p>
+    <w:p>
+      <w:pPr>
+        <w:pStyle w:val="ListParagraph"/>
+        <w:numPr>
+          <w:ilvl w:val="0"/>
+          <w:numId w:val="2"/>
+        </w:numPr>
+        <w:spacing w:after="80"/>
+      </w:pPr>
+      <w:r>
+        <w:t xml:space="preserve">"El fraude con las tarjetas y el reporte de compras fraudulentas".</w:t>
+      </w:r>
+    </w:p>
+    <w:p>
+      <w:pPr>
+        <w:pStyle w:val="ListParagraph"/>
+        <w:numPr>
+          <w:ilvl w:val="0"/>
+          <w:numId w:val="2"/>
+        </w:numPr>
+        <w:spacing w:after="80"/>
+      </w:pPr>
+      <w:r>
+        <w:t xml:space="preserve">"Los reclamos por contracargos deberían ser solo atendidos por depto. de T/C".</w:t>
+      </w:r>
+    </w:p>
+    <w:p>
+      <w:pPr>
+        <w:pStyle w:val="ListParagraph"/>
+        <w:numPr>
+          <w:ilvl w:val="0"/>
+          <w:numId w:val="2"/>
+        </w:numPr>
+        <w:spacing w:after="80"/>
+      </w:pPr>
+      <w:r>
+        <w:t xml:space="preserve">"El tiempo de resolución", "tiempo de entrega" y "acreditación de puntos por promociones dentro de las fechas correspondientes".</w:t>
+      </w:r>
+    </w:p>
+    <w:p>
+      <w:pPr>
+        <w:spacing w:after="160"/>
+        <w:jc w:val="both"/>
+      </w:pPr>
       <w:r>
         <w:rPr>
           <w:b/>
           <w:bCs/>
         </w:rPr>
-        <w:t xml:space="preserve">"Nota de Crédito"</w:t>
-      </w:r>
-      <w:r>
-        <w:t xml:space="preserve">. Esto genera confusión en los asociados, que no pueden identificar el origen del descuento, y aumenta las consultas en las agencias.</w:t>
-      </w:r>
-    </w:p>
-    <w:p>
-      <w:pPr>
-        <w:spacing w:after="160"/>
-        <w:jc w:val="both"/>
-      </w:pPr>
-      <w:r>
-        <w:rPr>
-          <w:b/>
-          <w:bCs/>
-        </w:rPr>
-        <w:t xml:space="preserve">Requerimos:</w:t>
-      </w:r>
-    </w:p>
-    <w:p>
-      <w:pPr>
-        <w:pStyle w:val="ListParagraph"/>
-        <w:numPr>
-          <w:ilvl w:val="0"/>
-          <w:numId w:val="2"/>
-        </w:numPr>
-        <w:spacing w:after="80"/>
-      </w:pPr>
-      <w:r>
-        <w:t xml:space="preserve">Sustituir el concepto genérico "Nota de Crédito" por descripciones específicas por campaña o beneficio, por ejemplo: "Abono por promoción [nombre de campaña]" o "Devolución por beneficio [nombre]".</w:t>
-      </w:r>
-    </w:p>
-    <w:p>
-      <w:pPr>
-        <w:pStyle w:val="ListParagraph"/>
-        <w:numPr>
-          <w:ilvl w:val="0"/>
-          <w:numId w:val="2"/>
-        </w:numPr>
-        <w:spacing w:after="80"/>
-      </w:pPr>
-      <w:r>
-        <w:t xml:space="preserve">Aplicar este cambio en los estados de cuenta, en la banca en línea y en las consultas de agencia.</w:t>
-      </w:r>
-    </w:p>
-    <w:p>
-      <w:pPr>
-        <w:pStyle w:val="ListParagraph"/>
-        <w:numPr>
-          <w:ilvl w:val="0"/>
-          <w:numId w:val="2"/>
-        </w:numPr>
-        <w:spacing w:after="80"/>
-      </w:pPr>
-      <w:r>
-        <w:t xml:space="preserve">Presentar una propuesta del catálogo de conceptos para la aprobación de Comedica.</w:t>
-      </w:r>
-    </w:p>
-    <w:p>
-      <w:pPr>
-        <w:pStyle w:val="Heading2"/>
-      </w:pPr>
-      <w:r>
-        <w:t xml:space="preserve">5. Contracargos, fraude y acreditación de promociones</w:t>
-      </w:r>
-    </w:p>
-    <w:p>
-      <w:pPr>
-        <w:spacing w:after="160"/>
-        <w:jc w:val="both"/>
-      </w:pPr>
-      <w:r>
-        <w:rPr>
-          <w:b/>
-          <w:bCs/>
-        </w:rPr>
-        <w:t xml:space="preserve">Situación reportada:</w:t>
-      </w:r>
-      <w:r>
-        <w:t xml:space="preserve"> dificultad en la gestión de reclamos por contracargos y en el reporte de compras fraudulentas, tiempos largos de resolución y acreditación de puntos por promociones fuera de las fechas establecidas.</w:t>
-      </w:r>
-    </w:p>
-    <w:p>
-      <w:pPr>
-        <w:spacing w:after="160"/>
-        <w:jc w:val="both"/>
-      </w:pPr>
-      <w:r>
-        <w:rPr>
-          <w:b/>
-          <w:bCs/>
-        </w:rPr>
-        <w:t xml:space="preserve">Requerimos:</w:t>
-      </w:r>
-    </w:p>
-    <w:p>
-      <w:pPr>
-        <w:pStyle w:val="ListParagraph"/>
-        <w:numPr>
-          <w:ilvl w:val="0"/>
-          <w:numId w:val="2"/>
-        </w:numPr>
-        <w:spacing w:after="80"/>
-      </w:pPr>
-      <w:r>
-        <w:t xml:space="preserve">Tiempos máximos definidos para la atención de contracargos y de reportes de fraude, con informe mensual de casos y tiempos de resolución.</w:t>
-      </w:r>
-    </w:p>
-    <w:p>
-      <w:pPr>
-        <w:pStyle w:val="ListParagraph"/>
-        <w:numPr>
-          <w:ilvl w:val="0"/>
-          <w:numId w:val="2"/>
-        </w:numPr>
-        <w:spacing w:after="80"/>
-      </w:pPr>
-      <w:r>
-        <w:t xml:space="preserve">Un fortalecimiento del monitoreo de transacciones para prevenir fraudes, y un canal ágil para su reporte.</w:t>
-      </w:r>
-    </w:p>
-    <w:p>
-      <w:pPr>
-        <w:pStyle w:val="ListParagraph"/>
-        <w:numPr>
-          <w:ilvl w:val="0"/>
-          <w:numId w:val="2"/>
-        </w:numPr>
-        <w:spacing w:after="80"/>
-      </w:pPr>
-      <w:r>
-        <w:t xml:space="preserve">Garantizar la acreditación de puntos y beneficios dentro de las fechas pactadas en cada promoción, con reporte de cumplimiento al cierre de cada campaña.</w:t>
+        <w:t xml:space="preserve">Solicitamos:</w:t>
+      </w:r>
+    </w:p>
+    <w:p>
+      <w:pPr>
+        <w:pStyle w:val="ListParagraph"/>
+        <w:numPr>
+          <w:ilvl w:val="0"/>
+          <w:numId w:val="2"/>
+        </w:numPr>
+        <w:spacing w:after="80"/>
+      </w:pPr>
+      <w:r>
+        <w:t xml:space="preserve">Mejorar la atención del reporte de compras fraudulentas.</w:t>
+      </w:r>
+    </w:p>
+    <w:p>
+      <w:pPr>
+        <w:pStyle w:val="ListParagraph"/>
+        <w:numPr>
+          <w:ilvl w:val="0"/>
+          <w:numId w:val="2"/>
+        </w:numPr>
+        <w:spacing w:after="80"/>
+      </w:pPr>
+      <w:r>
+        <w:t xml:space="preserve">Reducir los tiempos de resolución de reclamos y contracargos.</w:t>
+      </w:r>
+    </w:p>
+    <w:p>
+      <w:pPr>
+        <w:pStyle w:val="ListParagraph"/>
+        <w:numPr>
+          <w:ilvl w:val="0"/>
+          <w:numId w:val="2"/>
+        </w:numPr>
+        <w:spacing w:after="80"/>
+      </w:pPr>
+      <w:r>
+        <w:t xml:space="preserve">Acreditar los puntos por promociones dentro de las fechas correspondientes.</w:t>
       </w:r>
     </w:p>
     <w:p>
@@ -994,7 +1066,7 @@
         <w:t xml:space="preserve">plan de acción formal</w:t>
       </w:r>
       <w:r>
-        <w:t xml:space="preserve"> que incluya, para cada punto: la causa identificada, las acciones correctivas, los responsables, las fechas de implementación y los indicadores de cumplimiento. Proponemos el siguiente calendario:</w:t>
+        <w:t xml:space="preserve"> que indique, para cada uno de los cinco puntos, la causa identificada, las acciones a tomar, los responsables y las fechas compromiso. Proponemos las siguientes fechas:</w:t>
       </w:r>
     </w:p>
     <w:tbl>
@@ -1075,7 +1147,7 @@
                 <w:sz w:val="19"/>
                 <w:szCs w:val="19"/>
               </w:rPr>
-              <w:t xml:space="preserve">Fecha límite</w:t>
+              <w:t xml:space="preserve">Fecha propuesta</w:t>
             </w:r>
           </w:p>
         </w:tc>
@@ -1298,7 +1370,7 @@
                 <w:sz w:val="19"/>
                 <w:szCs w:val="19"/>
               </w:rPr>
-              <w:t xml:space="preserve">Informe de casos pendientes de reversas y pagos duplicados</w:t>
+              <w:t xml:space="preserve">Primer informe de avance</w:t>
             </w:r>
           </w:p>
         </w:tc>
@@ -1327,133 +1399,7 @@
                 <w:sz w:val="19"/>
                 <w:szCs w:val="19"/>
               </w:rPr>
-              <w:t xml:space="preserve">Jueves 8 de octubre de 2026</w:t>
-            </w:r>
-          </w:p>
-        </w:tc>
-      </w:tr>
-      <w:tr>
-        <w:trPr>
-          <w:tblHeader w:val="false"/>
-        </w:trPr>
-        <w:tc>
-          <w:tcPr>
-            <w:tcW w:type="dxa" w:w="5961"/>
-            <w:tcBorders>
-              <w:top w:val="single" w:color="BFBFBF" w:sz="4"/>
-              <w:left w:val="single" w:color="BFBFBF" w:sz="4"/>
-              <w:bottom w:val="single" w:color="BFBFBF" w:sz="4"/>
-              <w:right w:val="single" w:color="BFBFBF" w:sz="4"/>
-            </w:tcBorders>
-            <w:shd w:fill="FFFFFF" w:color="auto" w:val="clear"/>
-            <w:tcMar>
-              <w:top w:type="dxa" w:w="50"/>
-              <w:left w:type="dxa" w:w="80"/>
-              <w:bottom w:type="dxa" w:w="50"/>
-              <w:right w:type="dxa" w:w="80"/>
-            </w:tcMar>
-          </w:tcPr>
-          <w:p>
-            <w:r>
-              <w:rPr>
-                <w:rFonts w:ascii="Calibri" w:cs="Calibri" w:eastAsia="Calibri" w:hAnsi="Calibri"/>
-                <w:color w:val="000000"/>
-                <w:sz w:val="19"/>
-                <w:szCs w:val="19"/>
-              </w:rPr>
-              <w:t xml:space="preserve">Primer informe de avance</w:t>
-            </w:r>
-          </w:p>
-        </w:tc>
-        <w:tc>
-          <w:tcPr>
-            <w:tcW w:type="dxa" w:w="3975"/>
-            <w:tcBorders>
-              <w:top w:val="single" w:color="BFBFBF" w:sz="4"/>
-              <w:left w:val="single" w:color="BFBFBF" w:sz="4"/>
-              <w:bottom w:val="single" w:color="BFBFBF" w:sz="4"/>
-              <w:right w:val="single" w:color="BFBFBF" w:sz="4"/>
-            </w:tcBorders>
-            <w:shd w:fill="FFFFFF" w:color="auto" w:val="clear"/>
-            <w:tcMar>
-              <w:top w:type="dxa" w:w="50"/>
-              <w:left w:type="dxa" w:w="80"/>
-              <w:bottom w:type="dxa" w:w="50"/>
-              <w:right w:type="dxa" w:w="80"/>
-            </w:tcMar>
-          </w:tcPr>
-          <w:p>
-            <w:r>
-              <w:rPr>
-                <w:rFonts w:ascii="Calibri" w:cs="Calibri" w:eastAsia="Calibri" w:hAnsi="Calibri"/>
-                <w:color w:val="000000"/>
-                <w:sz w:val="19"/>
-                <w:szCs w:val="19"/>
-              </w:rPr>
               <w:t xml:space="preserve">Viernes 30 de octubre de 2026</w:t>
-            </w:r>
-          </w:p>
-        </w:tc>
-      </w:tr>
-      <w:tr>
-        <w:trPr>
-          <w:tblHeader w:val="false"/>
-        </w:trPr>
-        <w:tc>
-          <w:tcPr>
-            <w:tcW w:type="dxa" w:w="5961"/>
-            <w:tcBorders>
-              <w:top w:val="single" w:color="BFBFBF" w:sz="4"/>
-              <w:left w:val="single" w:color="BFBFBF" w:sz="4"/>
-              <w:bottom w:val="single" w:color="BFBFBF" w:sz="4"/>
-              <w:right w:val="single" w:color="BFBFBF" w:sz="4"/>
-            </w:tcBorders>
-            <w:shd w:fill="EAF1FB" w:color="auto" w:val="clear"/>
-            <w:tcMar>
-              <w:top w:type="dxa" w:w="50"/>
-              <w:left w:type="dxa" w:w="80"/>
-              <w:bottom w:type="dxa" w:w="50"/>
-              <w:right w:type="dxa" w:w="80"/>
-            </w:tcMar>
-          </w:tcPr>
-          <w:p>
-            <w:r>
-              <w:rPr>
-                <w:rFonts w:ascii="Calibri" w:cs="Calibri" w:eastAsia="Calibri" w:hAnsi="Calibri"/>
-                <w:color w:val="000000"/>
-                <w:sz w:val="19"/>
-                <w:szCs w:val="19"/>
-              </w:rPr>
-              <w:t xml:space="preserve">Seguimiento mensual del cumplimiento de SLA</w:t>
-            </w:r>
-          </w:p>
-        </w:tc>
-        <w:tc>
-          <w:tcPr>
-            <w:tcW w:type="dxa" w:w="3975"/>
-            <w:tcBorders>
-              <w:top w:val="single" w:color="BFBFBF" w:sz="4"/>
-              <w:left w:val="single" w:color="BFBFBF" w:sz="4"/>
-              <w:bottom w:val="single" w:color="BFBFBF" w:sz="4"/>
-              <w:right w:val="single" w:color="BFBFBF" w:sz="4"/>
-            </w:tcBorders>
-            <w:shd w:fill="EAF1FB" w:color="auto" w:val="clear"/>
-            <w:tcMar>
-              <w:top w:type="dxa" w:w="50"/>
-              <w:left w:type="dxa" w:w="80"/>
-              <w:bottom w:type="dxa" w:w="50"/>
-              <w:right w:type="dxa" w:w="80"/>
-            </w:tcMar>
-          </w:tcPr>
-          <w:p>
-            <w:r>
-              <w:rPr>
-                <w:rFonts w:ascii="Calibri" w:cs="Calibri" w:eastAsia="Calibri" w:hAnsi="Calibri"/>
-                <w:color w:val="000000"/>
-                <w:sz w:val="19"/>
-                <w:szCs w:val="19"/>
-              </w:rPr>
-              <w:t xml:space="preserve">Primera semana de cada mes</w:t>
             </w:r>
           </w:p>
         </w:tc>
@@ -1470,7 +1416,7 @@
         <w:jc w:val="both"/>
       </w:pPr>
       <w:r>
-        <w:t xml:space="preserve">Mantendremos el seguimiento de estos compromisos en las revisiones periódicas del contrato. Los resultados serán considerados en la próxima evaluación del servicio. En caso de incumplimiento, se aplicarán las disposiciones contractuales correspondientes.</w:t>
+        <w:t xml:space="preserve">Daremos seguimiento a estos compromisos y los resultados serán considerados en la próxima evaluación del servicio.</w:t>
       </w:r>
     </w:p>
     <w:p>
@@ -1478,16 +1424,16 @@
         <w:pStyle w:val="Heading2"/>
       </w:pPr>
       <w:r>
-        <w:t xml:space="preserve">Acciones internas de Comedica</w:t>
-      </w:r>
-    </w:p>
-    <w:p>
-      <w:pPr>
-        <w:spacing w:after="160"/>
-        <w:jc w:val="both"/>
-      </w:pPr>
-      <w:r>
-        <w:t xml:space="preserve">Para el equipo directivo interno, se proponen las siguientes acciones complementarias:</w:t>
+        <w:t xml:space="preserve">Puntos para el equipo directivo interno</w:t>
+      </w:r>
+    </w:p>
+    <w:p>
+      <w:pPr>
+        <w:spacing w:after="160"/>
+        <w:jc w:val="both"/>
+      </w:pPr>
+      <w:r>
+        <w:t xml:space="preserve">Los colaboradores también reportaron aspectos que corresponden a Comedica:</w:t>
       </w:r>
     </w:p>
     <w:p>
@@ -1500,14 +1446,7 @@
         <w:spacing w:after="80"/>
       </w:pPr>
       <w:r>
-        <w:rPr>
-          <w:b/>
-          <w:bCs/>
-        </w:rPr>
-        <w:t xml:space="preserve">Gerencia de Operaciones:</w:t>
-      </w:r>
-      <w:r>
-        <w:t xml:space="preserve"> coordinar el seguimiento del plan de acción y consolidar mensualmente los incidentes reportados por las agencias.</w:t>
+        <w:t xml:space="preserve">"Los reclamos por contracargos deberían ser solo atendidos por depto. de T/C" y "Depto. de tarjeta debería atender todo tipo de consultas y no delegarlo a otra área".</w:t>
       </w:r>
     </w:p>
     <w:p>
@@ -1520,14 +1459,7 @@
         <w:spacing w:after="80"/>
       </w:pPr>
       <w:r>
-        <w:rPr>
-          <w:b/>
-          <w:bCs/>
-        </w:rPr>
-        <w:t xml:space="preserve">Departamento de Tarjetas:</w:t>
-      </w:r>
-      <w:r>
-        <w:t xml:space="preserve"> asumir la atención integral de consultas y reclamos por contracargos, sin derivarlos a otras áreas.</w:t>
+        <w:t xml:space="preserve">"Los cajeros tenga acceso a ver saldo de T/C adicionales".</w:t>
       </w:r>
     </w:p>
     <w:p>
@@ -1540,63 +1472,25 @@
         <w:spacing w:after="80"/>
       </w:pPr>
       <w:r>
-        <w:rPr>
-          <w:b/>
-          <w:bCs/>
-        </w:rPr>
-        <w:t xml:space="preserve">Gerencia de Riesgos:</w:t>
-      </w:r>
-      <w:r>
-        <w:t xml:space="preserve"> evaluar el impacto operativo y de fraude de los hallazgos, y dar seguimiento a los controles acordados con el proveedor.</w:t>
-      </w:r>
-    </w:p>
-    <w:p>
-      <w:pPr>
-        <w:pStyle w:val="ListParagraph"/>
-        <w:numPr>
-          <w:ilvl w:val="0"/>
-          <w:numId w:val="3"/>
-        </w:numPr>
-        <w:spacing w:after="80"/>
-      </w:pPr>
-      <w:r>
-        <w:rPr>
-          <w:b/>
-          <w:bCs/>
-        </w:rPr>
-        <w:t xml:space="preserve">Gerencia de Tecnología:</w:t>
-      </w:r>
-      <w:r>
-        <w:t xml:space="preserve"> validar la conciliación diaria de reversas y los reportes de disponibilidad del sistema.</w:t>
-      </w:r>
-    </w:p>
-    <w:p>
-      <w:pPr>
-        <w:pStyle w:val="ListParagraph"/>
-        <w:numPr>
-          <w:ilvl w:val="0"/>
-          <w:numId w:val="3"/>
-        </w:numPr>
-        <w:spacing w:after="80"/>
-      </w:pPr>
-      <w:r>
-        <w:rPr>
-          <w:b/>
-          <w:bCs/>
-        </w:rPr>
-        <w:t xml:space="preserve">Gerencia de Negocios:</w:t>
-      </w:r>
-      <w:r>
-        <w:t xml:space="preserve"> evaluar habilitar al personal de caja la consulta de saldos de tarjetas adicionales y analizar la viabilidad de aprobaciones automáticas para asociados calificados.</w:t>
-      </w:r>
-    </w:p>
-    <w:p>
-      <w:pPr>
-        <w:spacing w:after="160"/>
-        <w:jc w:val="both"/>
-      </w:pPr>
-      <w:r>
-        <w:t xml:space="preserve">Agradecemos de antemano su atención y quedamos atentos a su pronta respuesta. Confiamos en que, trabajando juntos, lograremos brindar a nuestros asociados el servicio de calidad que merecen.</w:t>
+        <w:t xml:space="preserve">"Aprobaciones automáticas para asociados calificados sin tanta documentación".</w:t>
+      </w:r>
+    </w:p>
+    <w:p>
+      <w:pPr>
+        <w:spacing w:after="160"/>
+        <w:jc w:val="both"/>
+      </w:pPr>
+      <w:r>
+        <w:t xml:space="preserve">Solicitamos que el equipo directivo evalúe estos puntos y defina a los responsables de darles seguimiento.</w:t>
+      </w:r>
+    </w:p>
+    <w:p>
+      <w:pPr>
+        <w:spacing w:after="160"/>
+        <w:jc w:val="both"/>
+      </w:pPr>
+      <w:r>
+        <w:t xml:space="preserve">Agradecemos de antemano su atención y quedamos atentos a su pronta respuesta.</w:t>
       </w:r>
     </w:p>
     <w:p>
@@ -1627,7 +1521,7 @@
         <w:jc w:val="both"/>
       </w:pPr>
       <w:r>
-        <w:t xml:space="preserve">Gerente de Operaciones</w:t>
+        <w:t xml:space="preserve">[Cargo]</w:t>
       </w:r>
     </w:p>
     <w:p>
@@ -1637,15 +1531,6 @@
       </w:pPr>
       <w:r>
         <w:t xml:space="preserve">Comedica</w:t>
-      </w:r>
-    </w:p>
-    <w:p>
-      <w:pPr>
-        <w:spacing w:after="160"/>
-        <w:jc w:val="both"/>
-      </w:pPr>
-      <w:r>
-        <w:t xml:space="preserve">[Teléfono] · [Correo electrónico]</w:t>
       </w:r>
     </w:p>
     <w:sectPr>

</xml_diff>